<commit_message>
feat: render datadog-cowork-plugin revision 04 with four voices
- master all variants to -16 LUFS with anti-imaging resampling
- archive the previous release locally and refresh analysis and Office QA

🎙️ - Generated by Copilot

Co-authored-by: Copilot <223556219+Copilot@users.noreply.github.com>
</commit_message>
<xml_diff>
--- a/projects/datadog-cowork-plugin/release/outputs/document.docx
+++ b/projects/datadog-cowork-plugin/release/outputs/document.docx
@@ -195,7 +195,7 @@
       <w:r>
         <w:drawing>
           <wp:inline distT="0" distB="0" distL="0" distR="0">
-            <wp:extent cx="4572000" cy="2571750"/>
+            <wp:extent cx="5486400" cy="3086100"/>
             <wp:effectExtent l="0" t="0" r="0" b="0"/>
             <wp:docPr id="100" name="visual-what-it-is" descr="Datadog data reaches an MCP-capable agent through the Datadog MCP Server. (mermaid diagram)"/>
             <wp:cNvGraphicFramePr>
@@ -209,7 +209,7 @@
                     <pic:cNvPicPr/>
                   </pic:nvPicPr>
                   <pic:blipFill>
-                    <a:blip r:embed="rId18"/>
+                    <a:blip r:embed="rId7"/>
                     <a:stretch>
                       <a:fillRect/>
                     </a:stretch>
@@ -217,7 +217,7 @@
                   <pic:spPr>
                     <a:xfrm>
                       <a:off x="0" y="0"/>
-                      <a:ext cx="4572000" cy="2571750"/>
+                      <a:ext cx="5486400" cy="3086100"/>
                     </a:xfrm>
                     <a:prstGeom prst="rect">
                       <a:avLst/>
@@ -294,9 +294,9 @@
       <w:r>
         <w:drawing>
           <wp:inline distT="0" distB="0" distL="0" distR="0">
-            <wp:extent cx="4572000" cy="2571750"/>
+            <wp:extent cx="5486400" cy="3086100"/>
             <wp:effectExtent l="0" t="0" r="0" b="0"/>
-            <wp:docPr id="100" name="mcp-flow" descr="Four-step flow: Datadog data, MCP server, Claude connector or plugin, your team, with existing permissions applying at each step."/>
+            <wp:docPr id="101" name="mcp-flow" descr="Four-step flow: Datadog data, MCP server, Claude connector or plugin, your team, with existing permissions applying at each step."/>
             <wp:cNvGraphicFramePr>
               <a:graphicFrameLocks noChangeAspect="1"/>
             </wp:cNvGraphicFramePr>
@@ -304,11 +304,11 @@
               <a:graphicData uri="http://schemas.openxmlformats.org/drawingml/2006/picture">
                 <pic:pic>
                   <pic:nvPicPr>
-                    <pic:cNvPr id="100" name="mcp-flow" descr="Four-step flow: Datadog data, MCP server, Claude connector or plugin, your team, with existing permissions applying at each step."/>
+                    <pic:cNvPr id="101" name="mcp-flow" descr="Four-step flow: Datadog data, MCP server, Claude connector or plugin, your team, with existing permissions applying at each step."/>
                     <pic:cNvPicPr/>
                   </pic:nvPicPr>
                   <pic:blipFill>
-                    <a:blip r:embed="rId17"/>
+                    <a:blip r:embed="rId6"/>
                     <a:stretch>
                       <a:fillRect/>
                     </a:stretch>
@@ -316,7 +316,7 @@
                   <pic:spPr>
                     <a:xfrm>
                       <a:off x="0" y="0"/>
-                      <a:ext cx="4572000" cy="2571750"/>
+                      <a:ext cx="5486400" cy="3086100"/>
                     </a:xfrm>
                     <a:prstGeom prst="rect">
                       <a:avLst/>
@@ -393,9 +393,9 @@
       <w:r>
         <w:drawing>
           <wp:inline distT="0" distB="0" distL="0" distR="0">
-            <wp:extent cx="4572000" cy="2571750"/>
+            <wp:extent cx="5486400" cy="3086100"/>
             <wp:effectExtent l="0" t="0" r="0" b="0"/>
-            <wp:docPr id="100" name="visual-setup" descr="Setup order: clear conflicts, install, choose a site, sign in. (mermaid diagram)"/>
+            <wp:docPr id="102" name="visual-setup" descr="Setup order: clear conflicts, install, choose a site, sign in. (mermaid diagram)"/>
             <wp:cNvGraphicFramePr>
               <a:graphicFrameLocks noChangeAspect="1"/>
             </wp:cNvGraphicFramePr>
@@ -403,11 +403,11 @@
               <a:graphicData uri="http://schemas.openxmlformats.org/drawingml/2006/picture">
                 <pic:pic>
                   <pic:nvPicPr>
-                    <pic:cNvPr id="100" name="visual-setup" descr="Setup order: clear conflicts, install, choose a site, sign in. (mermaid diagram)"/>
+                    <pic:cNvPr id="102" name="visual-setup" descr="Setup order: clear conflicts, install, choose a site, sign in. (mermaid diagram)"/>
                     <pic:cNvPicPr/>
                   </pic:nvPicPr>
                   <pic:blipFill>
-                    <a:blip r:embed="rId19"/>
+                    <a:blip r:embed="rId8"/>
                     <a:stretch>
                       <a:fillRect/>
                     </a:stretch>
@@ -415,7 +415,7 @@
                   <pic:spPr>
                     <a:xfrm>
                       <a:off x="0" y="0"/>
-                      <a:ext cx="4572000" cy="2571750"/>
+                      <a:ext cx="5486400" cy="3086100"/>
                     </a:xfrm>
                     <a:prstGeom prst="rect">
                       <a:avLst/>
@@ -487,9 +487,9 @@
       <w:r>
         <w:drawing>
           <wp:inline distT="0" distB="0" distL="0" distR="0">
-            <wp:extent cx="4572000" cy="2571750"/>
+            <wp:extent cx="5486400" cy="3086100"/>
             <wp:effectExtent l="0" t="0" r="0" b="0"/>
-            <wp:docPr id="100" name="visual-access" descr="Your Datadog permissions apply; no Datadog credentials go to the model provider. (excalidraw diagram)"/>
+            <wp:docPr id="103" name="visual-access" descr="Your Datadog permissions apply; no Datadog credentials go to the model provider. (excalidraw diagram)"/>
             <wp:cNvGraphicFramePr>
               <a:graphicFrameLocks noChangeAspect="1"/>
             </wp:cNvGraphicFramePr>
@@ -497,11 +497,11 @@
               <a:graphicData uri="http://schemas.openxmlformats.org/drawingml/2006/picture">
                 <pic:pic>
                   <pic:nvPicPr>
-                    <pic:cNvPr id="100" name="visual-access" descr="Your Datadog permissions apply; no Datadog credentials go to the model provider. (excalidraw diagram)"/>
+                    <pic:cNvPr id="103" name="visual-access" descr="Your Datadog permissions apply; no Datadog credentials go to the model provider. (excalidraw diagram)"/>
                     <pic:cNvPicPr/>
                   </pic:nvPicPr>
                   <pic:blipFill>
-                    <a:blip r:embed="rId20"/>
+                    <a:blip r:embed="rId9"/>
                     <a:stretch>
                       <a:fillRect/>
                     </a:stretch>
@@ -509,7 +509,7 @@
                   <pic:spPr>
                     <a:xfrm>
                       <a:off x="0" y="0"/>
-                      <a:ext cx="4572000" cy="2571750"/>
+                      <a:ext cx="5486400" cy="3086100"/>
                     </a:xfrm>
                     <a:prstGeom prst="rect">
                       <a:avLst/>
@@ -625,9 +625,9 @@
       <w:r>
         <w:drawing>
           <wp:inline distT="0" distB="0" distL="0" distR="0">
-            <wp:extent cx="4572000" cy="2571750"/>
+            <wp:extent cx="5486400" cy="3086100"/>
             <wp:effectExtent l="0" t="0" r="0" b="0"/>
-            <wp:docPr id="100" name="visual-risk" descr="Rollout checklist: Preview status, compliance ownership and supported sites. (marp diagram)"/>
+            <wp:docPr id="104" name="visual-risk" descr="Rollout checklist: Preview status, compliance ownership and supported sites. (marp diagram)"/>
             <wp:cNvGraphicFramePr>
               <a:graphicFrameLocks noChangeAspect="1"/>
             </wp:cNvGraphicFramePr>
@@ -635,11 +635,11 @@
               <a:graphicData uri="http://schemas.openxmlformats.org/drawingml/2006/picture">
                 <pic:pic>
                   <pic:nvPicPr>
-                    <pic:cNvPr id="100" name="visual-risk" descr="Rollout checklist: Preview status, compliance ownership and supported sites. (marp diagram)"/>
+                    <pic:cNvPr id="104" name="visual-risk" descr="Rollout checklist: Preview status, compliance ownership and supported sites. (marp diagram)"/>
                     <pic:cNvPicPr/>
                   </pic:nvPicPr>
                   <pic:blipFill>
-                    <a:blip r:embed="rId21"/>
+                    <a:blip r:embed="rId10"/>
                     <a:stretch>
                       <a:fillRect/>
                     </a:stretch>
@@ -647,7 +647,7 @@
                   <pic:spPr>
                     <a:xfrm>
                       <a:off x="0" y="0"/>
-                      <a:ext cx="4572000" cy="2571750"/>
+                      <a:ext cx="5486400" cy="3086100"/>
                     </a:xfrm>
                     <a:prstGeom prst="rect">
                       <a:avLst/>
@@ -669,152 +669,54 @@
       </w:r>
     </w:p>
     <w:p>
+      <w:pPr>
+        <w:keepLines/>
+      </w:pPr>
       <w:hyperlink r:id="rId2" w:history="1">
         <w:r>
           <w:rPr>
             <w:rStyle w:val="Hyperlink"/>
           </w:rPr>
-          <w:t>Datadog MCP Server (2026-09-29T17:00:00Z)</w:t>
+          <w:t>[ev-01, ev-12] Datadog MCP Server (retrieved 2026-09-29T17:00:00Z)</w:t>
         </w:r>
       </w:hyperlink>
     </w:p>
     <w:p>
+      <w:pPr>
+        <w:keepLines/>
+      </w:pPr>
       <w:hyperlink r:id="rId3" w:history="1">
         <w:r>
           <w:rPr>
             <w:rStyle w:val="Hyperlink"/>
           </w:rPr>
-          <w:t>Datadog Claude Code Plugin (2026-09-29T17:00:00Z)</w:t>
+          <w:t>[ev-02, ev-03, ev-08, ev-09, ev-11, ev-14] Datadog Claude Code Plugin (retrieved 2026-09-29T17:00:00Z)</w:t>
         </w:r>
       </w:hyperlink>
     </w:p>
     <w:p>
+      <w:pPr>
+        <w:keepLines/>
+      </w:pPr>
       <w:hyperlink r:id="rId4" w:history="1">
         <w:r>
           <w:rPr>
             <w:rStyle w:val="Hyperlink"/>
           </w:rPr>
-          <w:t>Datadog Claude Code Plugin (2026-09-29T17:00:00Z)</w:t>
+          <w:t>[ev-04] Datadog | Claude by Anthropic (retrieved 2026-09-29T17:00:00Z)</w:t>
         </w:r>
       </w:hyperlink>
     </w:p>
     <w:p>
+      <w:pPr>
+        <w:keepLines/>
+      </w:pPr>
       <w:hyperlink r:id="rId5" w:history="1">
         <w:r>
           <w:rPr>
             <w:rStyle w:val="Hyperlink"/>
           </w:rPr>
-          <w:t>Datadog | Claude by Anthropic (2026-09-29T17:00:00Z)</w:t>
-        </w:r>
-      </w:hyperlink>
-    </w:p>
-    <w:p>
-      <w:hyperlink r:id="rId6" w:history="1">
-        <w:r>
-          <w:rPr>
-            <w:rStyle w:val="Hyperlink"/>
-          </w:rPr>
-          <w:t>Set Up the Datadog MCP Server (2026-09-29T17:00:00Z)</w:t>
-        </w:r>
-      </w:hyperlink>
-    </w:p>
-    <w:p>
-      <w:hyperlink r:id="rId7" w:history="1">
-        <w:r>
-          <w:rPr>
-            <w:rStyle w:val="Hyperlink"/>
-          </w:rPr>
-          <w:t>Set Up the Datadog MCP Server (2026-09-29T17:00:00Z)</w:t>
-        </w:r>
-      </w:hyperlink>
-    </w:p>
-    <w:p>
-      <w:hyperlink r:id="rId8" w:history="1">
-        <w:r>
-          <w:rPr>
-            <w:rStyle w:val="Hyperlink"/>
-          </w:rPr>
-          <w:t>Set Up the Datadog MCP Server (2026-09-29T17:00:00Z)</w:t>
-        </w:r>
-      </w:hyperlink>
-    </w:p>
-    <w:p>
-      <w:hyperlink r:id="rId9" w:history="1">
-        <w:r>
-          <w:rPr>
-            <w:rStyle w:val="Hyperlink"/>
-          </w:rPr>
-          <w:t>Datadog Claude Code Plugin (2026-09-29T17:00:00Z)</w:t>
-        </w:r>
-      </w:hyperlink>
-    </w:p>
-    <w:p>
-      <w:hyperlink r:id="rId10" w:history="1">
-        <w:r>
-          <w:rPr>
-            <w:rStyle w:val="Hyperlink"/>
-          </w:rPr>
-          <w:t>Datadog Claude Code Plugin (2026-09-29T17:00:00Z)</w:t>
-        </w:r>
-      </w:hyperlink>
-    </w:p>
-    <w:p>
-      <w:hyperlink r:id="rId11" w:history="1">
-        <w:r>
-          <w:rPr>
-            <w:rStyle w:val="Hyperlink"/>
-          </w:rPr>
-          <w:t>Set Up the Datadog MCP Server (2026-09-29T17:00:00Z)</w:t>
-        </w:r>
-      </w:hyperlink>
-    </w:p>
-    <w:p>
-      <w:hyperlink r:id="rId12" w:history="1">
-        <w:r>
-          <w:rPr>
-            <w:rStyle w:val="Hyperlink"/>
-          </w:rPr>
-          <w:t>Datadog Claude Code Plugin (2026-09-29T17:00:00Z)</w:t>
-        </w:r>
-      </w:hyperlink>
-    </w:p>
-    <w:p>
-      <w:hyperlink r:id="rId13" w:history="1">
-        <w:r>
-          <w:rPr>
-            <w:rStyle w:val="Hyperlink"/>
-          </w:rPr>
-          <w:t>Datadog MCP Server (2026-09-29T17:00:00Z)</w:t>
-        </w:r>
-      </w:hyperlink>
-    </w:p>
-    <w:p>
-      <w:hyperlink r:id="rId14" w:history="1">
-        <w:r>
-          <w:rPr>
-            <w:rStyle w:val="Hyperlink"/>
-          </w:rPr>
-          <w:t>Set Up the Datadog MCP Server (2026-09-29T17:00:00Z)</w:t>
-        </w:r>
-      </w:hyperlink>
-    </w:p>
-    <w:p>
-      <w:hyperlink r:id="rId15" w:history="1">
-        <w:r>
-          <w:rPr>
-            <w:rStyle w:val="Hyperlink"/>
-          </w:rPr>
-          <w:t>Datadog Claude Code Plugin (2026-09-29T17:00:00Z)</w:t>
-        </w:r>
-      </w:hyperlink>
-    </w:p>
-    <w:p>
-      <w:hyperlink r:id="rId16" w:history="1">
-        <w:r>
-          <w:rPr>
-            <w:rStyle w:val="Hyperlink"/>
-          </w:rPr>
-          <w:t>Set Up the Datadog MCP Server (2026-09-29T17:00:00Z)</w:t>
+          <w:t>[ev-05, ev-06, ev-07, ev-10, ev-13, ev-15] Set Up the Datadog MCP Server (retrieved 2026-09-29T17:00:00Z)</w:t>
         </w:r>
       </w:hyperlink>
     </w:p>

</xml_diff>

<commit_message>
feat: regenerate datadog-cowork-plugin with its brand theme
- render four voices with the brand header band, palette and fonts

🎨 - Generated by Copilot

Co-authored-by: Copilot <223556219+Copilot@users.noreply.github.com>
</commit_message>
<xml_diff>
--- a/projects/datadog-cowork-plugin/release/outputs/document.docx
+++ b/projects/datadog-cowork-plugin/release/outputs/document.docx
@@ -103,37 +103,37 @@
     </w:p>
     <w:p>
       <w:r>
-        <w:t xml:space="preserve">Datadog for Claude Cowork. Your telemetry, one question away. Here is what the plugin does, how it connects, and where a team should be careful.</w:t>
-      </w:r>
-    </w:p>
-    <w:p>
-      <w:r>
-        <w:t xml:space="preserve">The Datadog Model Context Protocol server bridges your observability data to agents. Logs, metrics, traces, dashboards, and monitors become things you can simply ask about.</w:t>
-      </w:r>
-    </w:p>
-    <w:p>
-      <w:r>
-        <w:t xml:space="preserve">For Claude, including Cowork, the official connector is the recommended path, and it adds in-product visualizations. Claude Code installs the same server as a plugin from the official marketplace.</w:t>
-      </w:r>
-    </w:p>
-    <w:p>
-      <w:r>
-        <w:t xml:space="preserve">Setup is short. Choose your Datadog site, then sign in with OAuth in the browser. Keys are an alternative, and any older manual server or custom connector should be removed first.</w:t>
-      </w:r>
-    </w:p>
-    <w:p>
-      <w:r>
-        <w:t xml:space="preserve">Access is not widened. You still need the Datadog permissions for the data you query, and the plugin states that no Datadog credentials are sent to the model provider.</w:t>
-      </w:r>
-    </w:p>
-    <w:p>
-      <w:r>
-        <w:t xml:space="preserve">Tool groups can be switched on or off, so a team can expose only the products it needs. Start with one narrow toolset.</w:t>
-      </w:r>
-    </w:p>
-    <w:p>
-      <w:r>
-        <w:t xml:space="preserve">Treat the preview label as a rollout risk. The server is HIPAA eligible, yet you own compliance for the tools you connect, and government sites are not supported. Pilot with one team, keep permissions tight, then expand.</w:t>
+        <w:t xml:space="preserve">The Datadog plugin and connector let Claude query Datadog logs, metrics, traces, dashboards and monitors through the Datadog MCP Server.</w:t>
+      </w:r>
+    </w:p>
+    <w:p>
+      <w:r>
+        <w:t xml:space="preserve">The Datadog MCP Server links your observability data to any agent that speaks the Model Context Protocol, so you ask instead of clicking through screens.</w:t>
+      </w:r>
+    </w:p>
+    <w:p>
+      <w:r>
+        <w:t xml:space="preserve">Claude, including Cowork, uses the official connector. Claude Code installs the plugin from the official Anthropic marketplace.</w:t>
+      </w:r>
+    </w:p>
+    <w:p>
+      <w:r>
+        <w:t xml:space="preserve">Choose your Datadog site and sign in with OAuth. Keys are supported, and older manual servers or custom connectors should be removed first.</w:t>
+      </w:r>
+    </w:p>
+    <w:p>
+      <w:r>
+        <w:t xml:space="preserve">You need Datadog permissions for the resources you query, and no Datadog credentials are sent to the model provider.</w:t>
+      </w:r>
+    </w:p>
+    <w:p>
+      <w:r>
+        <w:t xml:space="preserve">Enable or disable groups of MCP tools so the agent sees only the Datadog products your team needs.</w:t>
+      </w:r>
+    </w:p>
+    <w:p>
+      <w:r>
+        <w:t xml:space="preserve">The plugin is in Preview. The server is HIPAA-eligible, but you own compliance for connected tools, and the government sites are unsupported.</w:t>
       </w:r>
     </w:p>
     <w:p>
@@ -733,8 +733,8 @@
   <w:docDefaults>
     <w:rPrDefault>
       <w:rPr>
-        <w:rFonts w:ascii="Segoe UI" w:hAnsi="Segoe UI" w:cs="Segoe UI"/>
-        <w:color w:val="111827"/>
+        <w:rFonts w:ascii="nationalweb" w:hAnsi="nationalweb" w:cs="nationalweb"/>
+        <w:color w:val="000000"/>
         <w:sz w:val="22"/>
       </w:rPr>
     </w:rPrDefault>
@@ -755,13 +755,16 @@
     <w:qFormat/>
     <w:pPr>
       <w:keepNext/>
+      <w:pBdr>
+        <w:bottom w:val="single" w:sz="24" w:space="6" w:color="BEAAFF"/>
+      </w:pBdr>
       <w:spacing w:before="0" w:after="240"/>
       <w:jc w:val="left"/>
     </w:pPr>
     <w:rPr>
-      <w:rFonts w:ascii="Segoe UI" w:hAnsi="Segoe UI" w:cs="Segoe UI"/>
+      <w:rFonts w:ascii="Noto Sans JP" w:hAnsi="Noto Sans JP" w:cs="Noto Sans JP"/>
       <w:b/>
-      <w:color w:val="5E469E"/>
+      <w:color w:val="000000"/>
       <w:sz w:val="52"/>
     </w:rPr>
   </w:style>
@@ -776,9 +779,9 @@
       <w:outlineLvl w:val="0"/>
     </w:pPr>
     <w:rPr>
-      <w:rFonts w:ascii="Segoe UI" w:hAnsi="Segoe UI" w:cs="Segoe UI"/>
+      <w:rFonts w:ascii="Noto Sans JP" w:hAnsi="Noto Sans JP" w:cs="Noto Sans JP"/>
       <w:b/>
-      <w:color w:val="5E469E"/>
+      <w:color w:val="000000"/>
       <w:sz w:val="32"/>
     </w:rPr>
   </w:style>
@@ -793,16 +796,16 @@
       <w:outlineLvl w:val="1"/>
     </w:pPr>
     <w:rPr>
-      <w:rFonts w:ascii="Segoe UI" w:hAnsi="Segoe UI" w:cs="Segoe UI"/>
+      <w:rFonts w:ascii="Noto Sans JP" w:hAnsi="Noto Sans JP" w:cs="Noto Sans JP"/>
       <w:b/>
-      <w:color w:val="5E469E"/>
+      <w:color w:val="000000"/>
       <w:sz w:val="24"/>
     </w:rPr>
   </w:style>
   <w:style w:type="character" w:styleId="Hyperlink">
     <w:name w:val="Hyperlink"/>
     <w:rPr>
-      <w:color w:val="0563C1"/>
+      <w:color w:val="632CA6"/>
       <w:u w:val="single"/>
     </w:rPr>
   </w:style>

</xml_diff>